<commit_message>
chore(sst-env): remove deprecated sst-env.d.ts files and update .gitignore
- Deleted multiple instances of sst-env.d.ts files across various packages to clean up unused declarations.
- Updated .gitignore to include sst-env.d.ts to prevent future tracking of auto-generated files.
- Adjusted posthogProjectToken handling in the infra package to ensure stability across environments.
</commit_message>
<xml_diff>
--- a/apps/web/src/features/resume/wilsonchow_resume.docx
+++ b/apps/web/src/features/resume/wilsonchow_resume.docx
@@ -14,7 +14,7 @@
           <w:color w:val="1A1A1A"/>
           <w:sz w:val="44"/>
         </w:rPr>
-        <w:t>Wilson Chow</w:t>
+        <w:t>Wilson, Chow Sin Long</w:t>
       </w:r>
     </w:p>
     <w:p>
@@ -90,20 +90,6 @@
           <w:sz w:val="21"/>
         </w:rPr>
         <w:t>Strengths: end-to-end product ownership · React · frontend engineering · production AI agents · design systems.</w:t>
-      </w:r>
-    </w:p>
-    <w:p>
-      <w:pPr>
-        <w:spacing w:after="40" w:before="0"/>
-      </w:pPr>
-      <w:r>
-        <w:rPr>
-          <w:rFonts w:ascii="Calibri" w:hAnsi="Calibri" w:eastAsia="Calibri"/>
-          <w:b w:val="0"/>
-          <w:color w:val="1A1A1A"/>
-          <w:sz w:val="21"/>
-        </w:rPr>
-        <w:t>Stack: Next.js, React Native, Hono, Drizzle, OpenAPI / tRPC / GraphQL, Mastra, AI SDK, Langchain, Postgres, SST, Terraform, AWS, Vercel; headless CMS and search with Strapi, Sanity, Meilisearch.</w:t>
       </w:r>
     </w:p>
     <w:p>
@@ -535,6 +521,11 @@
         </w:rPr>
         <w:t>Shipped a TipTap @mention file-tagging component for attaching workspace files into agent prompts.</w:t>
       </w:r>
+    </w:p>
+    <w:p>
+      <w:pPr>
+        <w:spacing w:after="0" w:before="0"/>
+      </w:pPr>
     </w:p>
     <w:p>
       <w:pPr>
@@ -1170,38 +1161,6 @@
         <w:t>MPharm Pharmacy — First Class Honours</w:t>
       </w:r>
     </w:p>
-    <w:p>
-      <w:pPr>
-        <w:pStyle w:val="ListBullet"/>
-        <w:spacing w:after="30" w:before="0"/>
-        <w:ind w:left="288"/>
-      </w:pPr>
-      <w:r>
-        <w:rPr>
-          <w:rFonts w:ascii="Calibri" w:hAnsi="Calibri" w:eastAsia="Calibri"/>
-          <w:b w:val="0"/>
-          <w:color w:val="1A1A1A"/>
-          <w:sz w:val="21"/>
-        </w:rPr>
-        <w:t>Registered Pharmacist, GPhC, 2021 – Present</w:t>
-      </w:r>
-    </w:p>
-    <w:p>
-      <w:pPr>
-        <w:pStyle w:val="ListBullet"/>
-        <w:spacing w:after="30" w:before="0"/>
-        <w:ind w:left="288"/>
-      </w:pPr>
-      <w:r>
-        <w:rPr>
-          <w:rFonts w:ascii="Calibri" w:hAnsi="Calibri" w:eastAsia="Calibri"/>
-          <w:b w:val="0"/>
-          <w:color w:val="1A1A1A"/>
-          <w:sz w:val="21"/>
-        </w:rPr>
-        <w:t>Career switch into software; comfortable in rigorous, detail-heavy problem spaces</w:t>
-      </w:r>
-    </w:p>
     <w:sectPr>
       <w:pgSz w:w="12240" w:h="15840"/>
       <w:pgMar w:top="792" w:right="1008" w:bottom="792" w:left="1008" w:header="720" w:footer="720" w:gutter="0"/>

</xml_diff>

<commit_message>
feat(resume): add new resume variants and enhance content structure
- Introduced new resume variants for frontend, full-stack, and AI roles, each with tailored content to highlight relevant skills and experiences.
- Updated the source configuration to include a category field for better content organization.
- Enhanced robots.txt to disallow indexing of specific resume paths for improved SEO management.
- Improved ListNotes component to support preview functionality, allowing for better content display in various contexts.
- Adjusted styles and layout across multiple components for improved responsiveness and readability.
</commit_message>
<xml_diff>
--- a/apps/web/src/features/resume/wilsonchow_resume.docx
+++ b/apps/web/src/features/resume/wilsonchow_resume.docx
@@ -44,7 +44,7 @@
           <w:color w:val="2C2C2C"/>
           <w:sz w:val="20"/>
         </w:rPr>
-        <w:t>Full-Stack Product Engineer  ·  AWS Solutions Architect Associate</w:t>
+        <w:t>Full-Stack Software Engineer  ·  AWS Solutions Architect Associate</w:t>
       </w:r>
     </w:p>
     <w:p>
@@ -75,7 +75,7 @@
           <w:color w:val="1A1A1A"/>
           <w:sz w:val="21"/>
         </w:rPr>
-        <w:t>Full-stack product engineer with 5 years of experience owning delivery from Figma design through React / React Native, typed APIs, and AWS deploy. Shipped 15+ production web and mobile apps; cut critical-path load times by up to 80% and search latency by 90%. Currently leading a multi-channel agent platform with durable workflows, RAG, MCP servers, and evals. AWS Solutions Architect Associate.</w:t>
+        <w:t>Full-stack software engineer with 5 years of experience owning delivery from Figma design through React / React Native, typed APIs, and AWS deploy. Shipped 15+ production web and mobile apps; cut critical-path load times by up to 80% and search latency by 90%. Currently leading a multi-channel agent platform with durable workflows, memories, RAG, scorers, and evals. AWS Solutions Architect Associate.</w:t>
       </w:r>
     </w:p>
     <w:p>
@@ -89,7 +89,7 @@
           <w:color w:val="1A1A1A"/>
           <w:sz w:val="21"/>
         </w:rPr>
-        <w:t>Strengths: end-to-end product ownership · React · frontend engineering · production AI agents · design systems.</w:t>
+        <w:t>Strengths: End-to-end product delivery · Frontend engineering · AI Agents · Design systems · Figma</w:t>
       </w:r>
     </w:p>
     <w:p>
@@ -1161,6 +1161,38 @@
         <w:t>MPharm Pharmacy — First Class Honours</w:t>
       </w:r>
     </w:p>
+    <w:p>
+      <w:pPr>
+        <w:pStyle w:val="ListBullet"/>
+        <w:spacing w:after="30" w:before="0"/>
+        <w:ind w:left="288"/>
+      </w:pPr>
+      <w:r>
+        <w:rPr>
+          <w:rFonts w:ascii="Calibri" w:hAnsi="Calibri" w:eastAsia="Calibri"/>
+          <w:b w:val="0"/>
+          <w:color w:val="1A1A1A"/>
+          <w:sz w:val="21"/>
+        </w:rPr>
+        <w:t>Registered Pharmacist, GPhC, 2021 - Present</w:t>
+      </w:r>
+    </w:p>
+    <w:p>
+      <w:pPr>
+        <w:pStyle w:val="ListBullet"/>
+        <w:spacing w:after="30" w:before="0"/>
+        <w:ind w:left="288"/>
+      </w:pPr>
+      <w:r>
+        <w:rPr>
+          <w:rFonts w:ascii="Calibri" w:hAnsi="Calibri" w:eastAsia="Calibri"/>
+          <w:b w:val="0"/>
+          <w:color w:val="1A1A1A"/>
+          <w:sz w:val="21"/>
+        </w:rPr>
+        <w:t>Career switch into software because of passion for building things; comfortable in rigorous, detail-heavy problem spaces</w:t>
+      </w:r>
+    </w:p>
     <w:sectPr>
       <w:pgSz w:w="12240" w:h="15840"/>
       <w:pgMar w:top="792" w:right="1008" w:bottom="792" w:left="1008" w:header="720" w:footer="720" w:gutter="0"/>

</xml_diff>